<commit_message>
docs(exports): correct outbound event-code claims in the DOCX
Section 7 stated "Only three codes are ever sent to Wialon" and that
app-internal codes "never reach Wialon". Both false since diagnostics
telemetry (Option B: 24/25/26/27/29/40/41/42/43/44) and provisioning
events (301/303/304) push.

Rewrote the intro and closing note to state what actually reaches
Wialon (three task codes + diagnostics + provisioning) versus what
stays local (new-task, auto-save). The 179/180/35 table is unchanged.

This is the source for the exported PDF; the two superseded PDFs were
removed earlier (2f80fce). Regenerate the PDF from this corrected DOCX.
</commit_message>
<xml_diff>
--- a/docs/exports/HAMS_INTEGRATION_REFERENCE.docx
+++ b/docs/exports/HAMS_INTEGRATION_REFERENCE.docx
@@ -110,8 +110,6 @@
         <w:pStyle w:val="2"/>
         <w:spacing w:before="360" w:after="180"/>
       </w:pPr>
-      <w:bookmarkStart w:id="0" w:name="_GoBack"/>
-      <w:bookmarkEnd w:id="0"/>
       <w:r>
         <w:rPr>
           <w:rFonts w:ascii="Calibri" w:hAnsi="Calibri" w:eastAsia="Calibri" w:cs="Calibri"/>
@@ -123,6 +121,8 @@
         </w:rPr>
         <w:t>1.  What the app does</w:t>
       </w:r>
+      <w:bookmarkStart w:id="0" w:name="_GoBack"/>
+      <w:bookmarkEnd w:id="0"/>
     </w:p>
     <w:p>
       <w:pPr>
@@ -246,6 +246,10 @@
       <w:pPr>
         <w:pStyle w:val="2"/>
         <w:spacing w:before="360" w:after="180"/>
+        <w:rPr>
+          <w:rFonts w:hint="default"/>
+          <w:lang w:val="en-US"/>
+        </w:rPr>
       </w:pPr>
       <w:r>
         <w:rPr>
@@ -273,18 +277,11 @@
           <w:rFonts w:hint="default"/>
           <w:lang w:val="en-MY"/>
         </w:rPr>
-        <w:t xml:space="preserve">   </w:t>
-      </w:r>
-      <w:r>
-        <w:rPr>
-          <w:rFonts w:hint="default"/>
-          <w:lang w:val="en-US"/>
-        </w:rPr>
         <w:drawing>
           <wp:inline distT="0" distB="0" distL="114300" distR="114300">
-            <wp:extent cx="2846705" cy="6141720"/>
-            <wp:effectExtent l="0" t="0" r="3175" b="0"/>
-            <wp:docPr id="1" name="Picture 1" descr="WhatsApp Image 2026-05-26 at 08.58.44"/>
+            <wp:extent cx="1407160" cy="3112770"/>
+            <wp:effectExtent l="0" t="0" r="10160" b="11430"/>
+            <wp:docPr id="5" name="Picture 5" descr="app-06-devicepairing"/>
             <wp:cNvGraphicFramePr>
               <a:graphicFrameLocks xmlns:a="http://schemas.openxmlformats.org/drawingml/2006/main" noChangeAspect="1"/>
             </wp:cNvGraphicFramePr>
@@ -292,7 +289,7 @@
               <a:graphicData uri="http://schemas.openxmlformats.org/drawingml/2006/picture">
                 <pic:pic xmlns:pic="http://schemas.openxmlformats.org/drawingml/2006/picture">
                   <pic:nvPicPr>
-                    <pic:cNvPr id="1" name="Picture 1" descr="WhatsApp Image 2026-05-26 at 08.58.44"/>
+                    <pic:cNvPr id="5" name="Picture 5" descr="app-06-devicepairing"/>
                     <pic:cNvPicPr>
                       <a:picLocks noChangeAspect="1"/>
                     </pic:cNvPicPr>
@@ -306,7 +303,180 @@
                   <pic:spPr>
                     <a:xfrm>
                       <a:off x="0" y="0"/>
-                      <a:ext cx="2846705" cy="6141720"/>
+                      <a:ext cx="1407160" cy="3112770"/>
+                    </a:xfrm>
+                    <a:prstGeom prst="rect">
+                      <a:avLst/>
+                    </a:prstGeom>
+                  </pic:spPr>
+                </pic:pic>
+              </a:graphicData>
+            </a:graphic>
+          </wp:inline>
+        </w:drawing>
+        <w:t xml:space="preserve">   </w:t>
+      </w:r>
+      <w:r>
+        <w:rPr>
+          <w:rFonts w:hint="default"/>
+          <w:lang w:val="en-US"/>
+        </w:rPr>
+        <w:drawing>
+          <wp:inline distT="0" distB="0" distL="114300" distR="114300">
+            <wp:extent cx="1412240" cy="3126105"/>
+            <wp:effectExtent l="0" t="0" r="5080" b="13335"/>
+            <wp:docPr id="6" name="Picture 6" descr="app-01-count-screen"/>
+            <wp:cNvGraphicFramePr>
+              <a:graphicFrameLocks xmlns:a="http://schemas.openxmlformats.org/drawingml/2006/main" noChangeAspect="1"/>
+            </wp:cNvGraphicFramePr>
+            <a:graphic xmlns:a="http://schemas.openxmlformats.org/drawingml/2006/main">
+              <a:graphicData uri="http://schemas.openxmlformats.org/drawingml/2006/picture">
+                <pic:pic xmlns:pic="http://schemas.openxmlformats.org/drawingml/2006/picture">
+                  <pic:nvPicPr>
+                    <pic:cNvPr id="6" name="Picture 6" descr="app-01-count-screen"/>
+                    <pic:cNvPicPr>
+                      <a:picLocks noChangeAspect="1"/>
+                    </pic:cNvPicPr>
+                  </pic:nvPicPr>
+                  <pic:blipFill>
+                    <a:blip r:embed="rId7"/>
+                    <a:stretch>
+                      <a:fillRect/>
+                    </a:stretch>
+                  </pic:blipFill>
+                  <pic:spPr>
+                    <a:xfrm>
+                      <a:off x="0" y="0"/>
+                      <a:ext cx="1412240" cy="3126105"/>
+                    </a:xfrm>
+                    <a:prstGeom prst="rect">
+                      <a:avLst/>
+                    </a:prstGeom>
+                  </pic:spPr>
+                </pic:pic>
+              </a:graphicData>
+            </a:graphic>
+          </wp:inline>
+        </w:drawing>
+        <w:t xml:space="preserve">   </w:t>
+        <w:drawing>
+          <wp:inline distT="0" distB="0" distL="114300" distR="114300">
+            <wp:extent cx="1420495" cy="3141980"/>
+            <wp:effectExtent l="0" t="0" r="12065" b="12700"/>
+            <wp:docPr id="7" name="Picture 7" descr="app-03-admin-sheet"/>
+            <wp:cNvGraphicFramePr>
+              <a:graphicFrameLocks xmlns:a="http://schemas.openxmlformats.org/drawingml/2006/main" noChangeAspect="1"/>
+            </wp:cNvGraphicFramePr>
+            <a:graphic xmlns:a="http://schemas.openxmlformats.org/drawingml/2006/main">
+              <a:graphicData uri="http://schemas.openxmlformats.org/drawingml/2006/picture">
+                <pic:pic xmlns:pic="http://schemas.openxmlformats.org/drawingml/2006/picture">
+                  <pic:nvPicPr>
+                    <pic:cNvPr id="7" name="Picture 7" descr="app-03-admin-sheet"/>
+                    <pic:cNvPicPr>
+                      <a:picLocks noChangeAspect="1"/>
+                    </pic:cNvPicPr>
+                  </pic:nvPicPr>
+                  <pic:blipFill>
+                    <a:blip r:embed="rId8"/>
+                    <a:stretch>
+                      <a:fillRect/>
+                    </a:stretch>
+                  </pic:blipFill>
+                  <pic:spPr>
+                    <a:xfrm>
+                      <a:off x="0" y="0"/>
+                      <a:ext cx="1420495" cy="3141980"/>
+                    </a:xfrm>
+                    <a:prstGeom prst="rect">
+                      <a:avLst/>
+                    </a:prstGeom>
+                  </pic:spPr>
+                </pic:pic>
+              </a:graphicData>
+            </a:graphic>
+          </wp:inline>
+        </w:drawing>
+      </w:r>
+    </w:p>
+    <w:p>
+      <w:pPr>
+        <w:spacing w:before="0" w:after="80"/>
+        <w:jc w:val="center"/>
+        <w:rPr>
+          <w:rFonts w:hint="default"/>
+          <w:lang w:val="en-US"/>
+        </w:rPr>
+      </w:pPr>
+      <w:r>
+        <w:rPr>
+          <w:rFonts w:hint="default"/>
+          <w:lang w:val="en-US"/>
+        </w:rPr>
+        <w:drawing>
+          <wp:inline distT="0" distB="0" distL="114300" distR="114300">
+            <wp:extent cx="1268730" cy="2807970"/>
+            <wp:effectExtent l="0" t="0" r="11430" b="11430"/>
+            <wp:docPr id="8" name="Picture 8" descr="app-04-supervisor-code"/>
+            <wp:cNvGraphicFramePr>
+              <a:graphicFrameLocks xmlns:a="http://schemas.openxmlformats.org/drawingml/2006/main" noChangeAspect="1"/>
+            </wp:cNvGraphicFramePr>
+            <a:graphic xmlns:a="http://schemas.openxmlformats.org/drawingml/2006/main">
+              <a:graphicData uri="http://schemas.openxmlformats.org/drawingml/2006/picture">
+                <pic:pic xmlns:pic="http://schemas.openxmlformats.org/drawingml/2006/picture">
+                  <pic:nvPicPr>
+                    <pic:cNvPr id="8" name="Picture 8" descr="app-04-supervisor-code"/>
+                    <pic:cNvPicPr>
+                      <a:picLocks noChangeAspect="1"/>
+                    </pic:cNvPicPr>
+                  </pic:nvPicPr>
+                  <pic:blipFill>
+                    <a:blip r:embed="rId9"/>
+                    <a:stretch>
+                      <a:fillRect/>
+                    </a:stretch>
+                  </pic:blipFill>
+                  <pic:spPr>
+                    <a:xfrm>
+                      <a:off x="0" y="0"/>
+                      <a:ext cx="1268730" cy="2807970"/>
+                    </a:xfrm>
+                    <a:prstGeom prst="rect">
+                      <a:avLst/>
+                    </a:prstGeom>
+                  </pic:spPr>
+                </pic:pic>
+              </a:graphicData>
+            </a:graphic>
+          </wp:inline>
+        </w:drawing>
+        <w:t xml:space="preserve">    </w:t>
+        <w:drawing>
+          <wp:inline distT="0" distB="0" distL="114300" distR="114300">
+            <wp:extent cx="1275080" cy="2820670"/>
+            <wp:effectExtent l="0" t="0" r="5080" b="13970"/>
+            <wp:docPr id="9" name="Picture 9" descr="app-05-notifications"/>
+            <wp:cNvGraphicFramePr>
+              <a:graphicFrameLocks xmlns:a="http://schemas.openxmlformats.org/drawingml/2006/main" noChangeAspect="1"/>
+            </wp:cNvGraphicFramePr>
+            <a:graphic xmlns:a="http://schemas.openxmlformats.org/drawingml/2006/main">
+              <a:graphicData uri="http://schemas.openxmlformats.org/drawingml/2006/picture">
+                <pic:pic xmlns:pic="http://schemas.openxmlformats.org/drawingml/2006/picture">
+                  <pic:nvPicPr>
+                    <pic:cNvPr id="9" name="Picture 9" descr="app-05-notifications"/>
+                    <pic:cNvPicPr>
+                      <a:picLocks noChangeAspect="1"/>
+                    </pic:cNvPicPr>
+                  </pic:nvPicPr>
+                  <pic:blipFill>
+                    <a:blip r:embed="rId10"/>
+                    <a:stretch>
+                      <a:fillRect/>
+                    </a:stretch>
+                  </pic:blipFill>
+                  <pic:spPr>
+                    <a:xfrm>
+                      <a:off x="0" y="0"/>
+                      <a:ext cx="1275080" cy="2820670"/>
                     </a:xfrm>
                     <a:prstGeom prst="rect">
                       <a:avLst/>
@@ -811,14 +981,6 @@
                 <w:szCs w:val="18"/>
               </w:rPr>
               <w:br w:type="textWrapping"/>
-            </w:r>
-            <w:r>
-              <w:rPr>
-                <w:rFonts w:ascii="Calibri" w:hAnsi="Calibri" w:eastAsia="Calibri" w:cs="Calibri"/>
-                <w:color w:val="595959"/>
-                <w:sz w:val="18"/>
-                <w:szCs w:val="18"/>
-              </w:rPr>
               <w:t xml:space="preserve">Spec: </w:t>
             </w:r>
             <w:r>
@@ -829,23 +991,7 @@
                 <w:szCs w:val="18"/>
               </w:rPr>
               <w:fldChar w:fldCharType="begin"/>
-            </w:r>
-            <w:r>
-              <w:rPr>
-                <w:rFonts w:hint="default" w:ascii="Calibri" w:hAnsi="Calibri" w:eastAsia="Calibri" w:cs="Calibri"/>
-                <w:color w:val="595959"/>
-                <w:sz w:val="18"/>
-                <w:szCs w:val="18"/>
-              </w:rPr>
               <w:instrText xml:space="preserve"> HYPERLINK "https://help.wialon.com/en/wialon-hosting/user-guide/hardware/connecting-hardware#ivedesignedmyowngpsdevicewhichcommunicationprotocolshouldiimplement" </w:instrText>
-            </w:r>
-            <w:r>
-              <w:rPr>
-                <w:rFonts w:hint="default" w:ascii="Calibri" w:hAnsi="Calibri" w:eastAsia="Calibri" w:cs="Calibri"/>
-                <w:color w:val="595959"/>
-                <w:sz w:val="18"/>
-                <w:szCs w:val="18"/>
-              </w:rPr>
               <w:fldChar w:fldCharType="separate"/>
             </w:r>
             <w:r>
@@ -5766,7 +5912,7 @@
           <w:sz w:val="22"/>
           <w:szCs w:val="22"/>
         </w:rPr>
-        <w:t>Only three codes are ever sent to Wialon.</w:t>
+        <w:t>Three codes carry harvest task data to Wialon (below). The app also sends diagnostics telemetry and provisioning events — see the note after the table.</w:t>
       </w:r>
     </w:p>
     <w:tbl>
@@ -6400,7 +6546,7 @@
           <w:sz w:val="22"/>
           <w:szCs w:val="22"/>
         </w:rPr>
-        <w:t>App-internal lifecycle and health codes are stored on the device only and never reach Wialon.</w:t>
+        <w:t>Beyond the three task codes, the app also sends diagnostics telemetry (device, GPS and power events: 24, 25, 26, 27, 29, 40, 41, 42, 43, 44) and provisioning events (301 binding released, 303 device bound, 304 device unbound). Only true app-internal lifecycle markers — new-task and auto-save — stay on the device and never reach Wialon.</w:t>
       </w:r>
     </w:p>
     <w:p>
@@ -10085,7 +10231,7 @@
                     </pic:cNvPicPr>
                   </pic:nvPicPr>
                   <pic:blipFill>
-                    <a:blip r:embed="rId7"/>
+                    <a:blip r:embed="rId11"/>
                     <a:stretch>
                       <a:fillRect/>
                     </a:stretch>
@@ -10138,7 +10284,7 @@
                     </pic:cNvPicPr>
                   </pic:nvPicPr>
                   <pic:blipFill>
-                    <a:blip r:embed="rId8"/>
+                    <a:blip r:embed="rId12"/>
                     <a:stretch>
                       <a:fillRect/>
                     </a:stretch>

</xml_diff>